<commit_message>
Update: Replaced old Word and PPT files with updated versions
</commit_message>
<xml_diff>
--- a/Laporan_Tugas_Fuzzy_Logic.docx
+++ b/Laporan_Tugas_Fuzzy_Logic.docx
@@ -66,7 +66,6 @@
           <w:szCs w:val="24"/>
         </w:rPr>
       </w:pPr>
-      <w:proofErr w:type="spellStart"/>
       <w:r>
         <w:rPr>
           <w:rFonts w:ascii="Times New Roman" w:hAnsi="Times New Roman" w:cs="Times New Roman"/>
@@ -74,117 +73,7 @@
           <w:sz w:val="24"/>
           <w:szCs w:val="24"/>
         </w:rPr>
-        <w:t>Sistem</w:t>
-      </w:r>
-      <w:proofErr w:type="spellEnd"/>
-      <w:r>
-        <w:rPr>
-          <w:rFonts w:ascii="Times New Roman" w:hAnsi="Times New Roman" w:cs="Times New Roman"/>
-          <w:color w:val="auto"/>
-          <w:sz w:val="24"/>
-          <w:szCs w:val="24"/>
-        </w:rPr>
-        <w:t xml:space="preserve"> </w:t>
-      </w:r>
-      <w:proofErr w:type="spellStart"/>
-      <w:r>
-        <w:rPr>
-          <w:rFonts w:ascii="Times New Roman" w:hAnsi="Times New Roman" w:cs="Times New Roman"/>
-          <w:color w:val="auto"/>
-          <w:sz w:val="24"/>
-          <w:szCs w:val="24"/>
-        </w:rPr>
-        <w:t>Pendukung</w:t>
-      </w:r>
-      <w:proofErr w:type="spellEnd"/>
-      <w:r>
-        <w:rPr>
-          <w:rFonts w:ascii="Times New Roman" w:hAnsi="Times New Roman" w:cs="Times New Roman"/>
-          <w:color w:val="auto"/>
-          <w:sz w:val="24"/>
-          <w:szCs w:val="24"/>
-        </w:rPr>
-        <w:t xml:space="preserve"> Keputusan </w:t>
-      </w:r>
-      <w:proofErr w:type="spellStart"/>
-      <w:r>
-        <w:rPr>
-          <w:rFonts w:ascii="Times New Roman" w:hAnsi="Times New Roman" w:cs="Times New Roman"/>
-          <w:color w:val="auto"/>
-          <w:sz w:val="24"/>
-          <w:szCs w:val="24"/>
-        </w:rPr>
-        <w:t>Pemilihan</w:t>
-      </w:r>
-      <w:proofErr w:type="spellEnd"/>
-      <w:r>
-        <w:rPr>
-          <w:rFonts w:ascii="Times New Roman" w:hAnsi="Times New Roman" w:cs="Times New Roman"/>
-          <w:color w:val="auto"/>
-          <w:sz w:val="24"/>
-          <w:szCs w:val="24"/>
-        </w:rPr>
-        <w:t xml:space="preserve"> </w:t>
-      </w:r>
-      <w:proofErr w:type="spellStart"/>
-      <w:r>
-        <w:rPr>
-          <w:rFonts w:ascii="Times New Roman" w:hAnsi="Times New Roman" w:cs="Times New Roman"/>
-          <w:color w:val="auto"/>
-          <w:sz w:val="24"/>
-          <w:szCs w:val="24"/>
-        </w:rPr>
-        <w:t>Restoran</w:t>
-      </w:r>
-      <w:proofErr w:type="spellEnd"/>
-      <w:r>
-        <w:rPr>
-          <w:rFonts w:ascii="Times New Roman" w:hAnsi="Times New Roman" w:cs="Times New Roman"/>
-          <w:color w:val="auto"/>
-          <w:sz w:val="24"/>
-          <w:szCs w:val="24"/>
-        </w:rPr>
-        <w:t xml:space="preserve"> </w:t>
-      </w:r>
-      <w:proofErr w:type="spellStart"/>
-      <w:r>
-        <w:rPr>
-          <w:rFonts w:ascii="Times New Roman" w:hAnsi="Times New Roman" w:cs="Times New Roman"/>
-          <w:color w:val="auto"/>
-          <w:sz w:val="24"/>
-          <w:szCs w:val="24"/>
-        </w:rPr>
-        <w:t>Terbaik</w:t>
-      </w:r>
-      <w:proofErr w:type="spellEnd"/>
-      <w:r>
-        <w:rPr>
-          <w:rFonts w:ascii="Times New Roman" w:hAnsi="Times New Roman" w:cs="Times New Roman"/>
-          <w:color w:val="auto"/>
-          <w:sz w:val="24"/>
-          <w:szCs w:val="24"/>
-        </w:rPr>
-        <w:t xml:space="preserve"> </w:t>
-      </w:r>
-      <w:proofErr w:type="spellStart"/>
-      <w:r>
-        <w:rPr>
-          <w:rFonts w:ascii="Times New Roman" w:hAnsi="Times New Roman" w:cs="Times New Roman"/>
-          <w:color w:val="auto"/>
-          <w:sz w:val="24"/>
-          <w:szCs w:val="24"/>
-        </w:rPr>
-        <w:t>Menggunakan</w:t>
-      </w:r>
-      <w:proofErr w:type="spellEnd"/>
-      <w:r>
-        <w:rPr>
-          <w:rFonts w:ascii="Times New Roman" w:hAnsi="Times New Roman" w:cs="Times New Roman"/>
-          <w:color w:val="auto"/>
-          <w:sz w:val="24"/>
-          <w:szCs w:val="24"/>
-        </w:rPr>
-        <w:t xml:space="preserve"> Fuzzy Logic</w:t>
+        <w:t>Sistem Pendukung Keputusan Pemilihan Restoran Terbaik Menggunakan Fuzzy Logic</w:t>
       </w:r>
     </w:p>
     <w:p>
@@ -279,7 +168,6 @@
           <w:szCs w:val="24"/>
         </w:rPr>
       </w:pPr>
-      <w:proofErr w:type="spellStart"/>
       <w:r>
         <w:rPr>
           <w:rFonts w:ascii="Times New Roman" w:hAnsi="Times New Roman" w:cs="Times New Roman"/>
@@ -289,7 +177,6 @@
         </w:rPr>
         <w:t>Disusun</w:t>
       </w:r>
-      <w:proofErr w:type="spellEnd"/>
       <w:r>
         <w:rPr>
           <w:rFonts w:ascii="Times New Roman" w:hAnsi="Times New Roman" w:cs="Times New Roman"/>
@@ -430,7 +317,6 @@
                 <w:szCs w:val="24"/>
               </w:rPr>
             </w:pPr>
-            <w:proofErr w:type="spellStart"/>
             <w:r>
               <w:rPr>
                 <w:b/>
@@ -439,7 +325,6 @@
               </w:rPr>
               <w:t>Rodzy</w:t>
             </w:r>
-            <w:proofErr w:type="spellEnd"/>
             <w:r>
               <w:rPr>
                 <w:b/>
@@ -1297,61 +1182,7 @@
           <w:sz w:val="24"/>
           <w:szCs w:val="24"/>
         </w:rPr>
-        <w:t>-Buruk: Nilai &lt;= 30 (</w:t>
-      </w:r>
-      <w:proofErr w:type="spellStart"/>
-      <w:r>
-        <w:rPr>
-          <w:rFonts w:ascii="Times New Roman" w:hAnsi="Times New Roman" w:cs="Times New Roman"/>
-          <w:sz w:val="24"/>
-          <w:szCs w:val="24"/>
-        </w:rPr>
-        <w:t>Keanggotaan</w:t>
-      </w:r>
-      <w:proofErr w:type="spellEnd"/>
-      <w:r>
-        <w:rPr>
-          <w:rFonts w:ascii="Times New Roman" w:hAnsi="Times New Roman" w:cs="Times New Roman"/>
-          <w:sz w:val="24"/>
-          <w:szCs w:val="24"/>
-        </w:rPr>
-        <w:t xml:space="preserve"> </w:t>
-      </w:r>
-      <w:proofErr w:type="spellStart"/>
-      <w:r>
-        <w:rPr>
-          <w:rFonts w:ascii="Times New Roman" w:hAnsi="Times New Roman" w:cs="Times New Roman"/>
-          <w:sz w:val="24"/>
-          <w:szCs w:val="24"/>
-        </w:rPr>
-        <w:t>penuh</w:t>
-      </w:r>
-      <w:proofErr w:type="spellEnd"/>
-      <w:r>
-        <w:rPr>
-          <w:rFonts w:ascii="Times New Roman" w:hAnsi="Times New Roman" w:cs="Times New Roman"/>
-          <w:sz w:val="24"/>
-          <w:szCs w:val="24"/>
-        </w:rPr>
-        <w:t>), 30-50 (</w:t>
-      </w:r>
-      <w:proofErr w:type="spellStart"/>
-      <w:r>
-        <w:rPr>
-          <w:rFonts w:ascii="Times New Roman" w:hAnsi="Times New Roman" w:cs="Times New Roman"/>
-          <w:sz w:val="24"/>
-          <w:szCs w:val="24"/>
-        </w:rPr>
-        <w:t>Menurun</w:t>
-      </w:r>
-      <w:proofErr w:type="spellEnd"/>
-      <w:r>
-        <w:rPr>
-          <w:rFonts w:ascii="Times New Roman" w:hAnsi="Times New Roman" w:cs="Times New Roman"/>
-          <w:sz w:val="24"/>
-          <w:szCs w:val="24"/>
-        </w:rPr>
-        <w:t xml:space="preserve"> linear).</w:t>
+        <w:t>-Buruk: Nilai &lt;= 30 (Keanggotaan penuh), 30-50 (Menurun linear).</w:t>
       </w:r>
     </w:p>
     <w:p>
@@ -1370,61 +1201,7 @@
           <w:sz w:val="24"/>
           <w:szCs w:val="24"/>
         </w:rPr>
-        <w:t>-</w:t>
-      </w:r>
-      <w:proofErr w:type="spellStart"/>
-      <w:r>
-        <w:rPr>
-          <w:rFonts w:ascii="Times New Roman" w:hAnsi="Times New Roman" w:cs="Times New Roman"/>
-          <w:sz w:val="24"/>
-          <w:szCs w:val="24"/>
-        </w:rPr>
-        <w:t>Biasa</w:t>
-      </w:r>
-      <w:proofErr w:type="spellEnd"/>
-      <w:r>
-        <w:rPr>
-          <w:rFonts w:ascii="Times New Roman" w:hAnsi="Times New Roman" w:cs="Times New Roman"/>
-          <w:sz w:val="24"/>
-          <w:szCs w:val="24"/>
-        </w:rPr>
-        <w:t>: Nilai 40-60 (</w:t>
-      </w:r>
-      <w:proofErr w:type="spellStart"/>
-      <w:r>
-        <w:rPr>
-          <w:rFonts w:ascii="Times New Roman" w:hAnsi="Times New Roman" w:cs="Times New Roman"/>
-          <w:sz w:val="24"/>
-          <w:szCs w:val="24"/>
-        </w:rPr>
-        <w:t>Meningkat</w:t>
-      </w:r>
-      <w:proofErr w:type="spellEnd"/>
-      <w:r>
-        <w:rPr>
-          <w:rFonts w:ascii="Times New Roman" w:hAnsi="Times New Roman" w:cs="Times New Roman"/>
-          <w:sz w:val="24"/>
-          <w:szCs w:val="24"/>
-        </w:rPr>
-        <w:t xml:space="preserve"> linear), 60-80 (</w:t>
-      </w:r>
-      <w:proofErr w:type="spellStart"/>
-      <w:r>
-        <w:rPr>
-          <w:rFonts w:ascii="Times New Roman" w:hAnsi="Times New Roman" w:cs="Times New Roman"/>
-          <w:sz w:val="24"/>
-          <w:szCs w:val="24"/>
-        </w:rPr>
-        <w:t>Menurun</w:t>
-      </w:r>
-      <w:proofErr w:type="spellEnd"/>
-      <w:r>
-        <w:rPr>
-          <w:rFonts w:ascii="Times New Roman" w:hAnsi="Times New Roman" w:cs="Times New Roman"/>
-          <w:sz w:val="24"/>
-          <w:szCs w:val="24"/>
-        </w:rPr>
-        <w:t xml:space="preserve"> linear).</w:t>
+        <w:t>-Biasa: Nilai 40-60 (Meningkat linear), 60-80 (Menurun linear).</w:t>
       </w:r>
     </w:p>
     <w:p>
@@ -1484,25 +1261,7 @@
           <w:sz w:val="24"/>
           <w:szCs w:val="24"/>
         </w:rPr>
-        <w:t>-Murah:&lt;=25.000(Penuh),25rb-35</w:t>
-      </w:r>
-      <w:proofErr w:type="gramStart"/>
-      <w:r>
-        <w:rPr>
-          <w:rFonts w:ascii="Times New Roman" w:hAnsi="Times New Roman" w:cs="Times New Roman"/>
-          <w:sz w:val="24"/>
-          <w:szCs w:val="24"/>
-        </w:rPr>
-        <w:t>rb(</w:t>
-      </w:r>
-      <w:proofErr w:type="gramEnd"/>
-      <w:r>
-        <w:rPr>
-          <w:rFonts w:ascii="Times New Roman" w:hAnsi="Times New Roman" w:cs="Times New Roman"/>
-          <w:sz w:val="24"/>
-          <w:szCs w:val="24"/>
-        </w:rPr>
-        <w:t>Menurun).</w:t>
+        <w:t>-Murah:&lt;=25.000(Penuh),25rb-35rb(Menurun).</w:t>
       </w:r>
     </w:p>
     <w:p>
@@ -1596,47 +1355,7 @@
           <w:sz w:val="24"/>
           <w:szCs w:val="24"/>
         </w:rPr>
-        <w:t xml:space="preserve">2.2 </w:t>
-      </w:r>
-      <w:proofErr w:type="spellStart"/>
-      <w:r>
-        <w:rPr>
-          <w:rFonts w:ascii="Times New Roman" w:hAnsi="Times New Roman" w:cs="Times New Roman"/>
-          <w:color w:val="auto"/>
-          <w:sz w:val="24"/>
-          <w:szCs w:val="24"/>
-        </w:rPr>
-        <w:t>Aturan</w:t>
-      </w:r>
-      <w:proofErr w:type="spellEnd"/>
-      <w:r>
-        <w:rPr>
-          <w:rFonts w:ascii="Times New Roman" w:hAnsi="Times New Roman" w:cs="Times New Roman"/>
-          <w:color w:val="auto"/>
-          <w:sz w:val="24"/>
-          <w:szCs w:val="24"/>
-        </w:rPr>
-        <w:t xml:space="preserve"> </w:t>
-      </w:r>
-      <w:proofErr w:type="spellStart"/>
-      <w:r>
-        <w:rPr>
-          <w:rFonts w:ascii="Times New Roman" w:hAnsi="Times New Roman" w:cs="Times New Roman"/>
-          <w:color w:val="auto"/>
-          <w:sz w:val="24"/>
-          <w:szCs w:val="24"/>
-        </w:rPr>
-        <w:t>Inferensi</w:t>
-      </w:r>
-      <w:proofErr w:type="spellEnd"/>
-      <w:r>
-        <w:rPr>
-          <w:rFonts w:ascii="Times New Roman" w:hAnsi="Times New Roman" w:cs="Times New Roman"/>
-          <w:color w:val="auto"/>
-          <w:sz w:val="24"/>
-          <w:szCs w:val="24"/>
-        </w:rPr>
-        <w:t xml:space="preserve"> (Inference Rules)</w:t>
+        <w:t>2.2 Aturan Inferensi (Inference Rules)</w:t>
       </w:r>
     </w:p>
     <w:p>
@@ -2328,23 +2047,13 @@
         </w:rPr>
         <w:t xml:space="preserve">5. </w:t>
       </w:r>
-      <w:proofErr w:type="spellStart"/>
       <w:r>
         <w:rPr>
           <w:rFonts w:ascii="Times New Roman" w:hAnsi="Times New Roman" w:cs="Times New Roman"/>
           <w:sz w:val="24"/>
           <w:szCs w:val="24"/>
         </w:rPr>
-        <w:t>Mengurutkan</w:t>
-      </w:r>
-      <w:proofErr w:type="spellEnd"/>
-      <w:r>
-        <w:rPr>
-          <w:rFonts w:ascii="Times New Roman" w:hAnsi="Times New Roman" w:cs="Times New Roman"/>
-          <w:sz w:val="24"/>
-          <w:szCs w:val="24"/>
-        </w:rPr>
-        <w:t xml:space="preserve"> data (Sorting) dan menyimpan Top 5 ke file ranking.xlsx.</w:t>
+        <w:t>Mengurutkan data (Sorting) dan menyimpan Top 5 ke file ranking.xlsx.</w:t>
       </w:r>
     </w:p>
     <w:p>
@@ -2425,18 +2134,8 @@
                 <w:sz w:val="24"/>
                 <w:szCs w:val="24"/>
               </w:rPr>
-              <w:t xml:space="preserve">ID </w:t>
+              <w:t>ID Restoran</w:t>
             </w:r>
-            <w:proofErr w:type="spellStart"/>
-            <w:r>
-              <w:rPr>
-                <w:rFonts w:ascii="Times New Roman" w:hAnsi="Times New Roman" w:cs="Times New Roman"/>
-                <w:sz w:val="24"/>
-                <w:szCs w:val="24"/>
-              </w:rPr>
-              <w:t>Restoran</w:t>
-            </w:r>
-            <w:proofErr w:type="spellEnd"/>
           </w:p>
         </w:tc>
         <w:tc>
@@ -3050,6 +2749,180 @@
     </w:p>
     <w:p>
       <w:pPr>
+        <w:rPr>
+          <w:lang w:val="sv-SE"/>
+        </w:rPr>
+      </w:pPr>
+      <w:r>
+        <w:drawing>
+          <wp:inline distT="0" distB="0" distL="0" distR="0" wp14:anchorId="31322043" wp14:editId="6B0C77F7">
+            <wp:extent cx="3118963" cy="944862"/>
+            <wp:effectExtent l="0" t="0" r="5715" b="8255"/>
+            <wp:docPr id="10" name="Picture 9">
+              <a:extLst xmlns:a="http://schemas.openxmlformats.org/drawingml/2006/main">
+                <a:ext uri="{FF2B5EF4-FFF2-40B4-BE49-F238E27FC236}">
+                  <a16:creationId xmlns:a16="http://schemas.microsoft.com/office/drawing/2014/main" id="{A200B9B1-6373-DA60-559C-ABB5D968E950}"/>
+                </a:ext>
+              </a:extLst>
+            </wp:docPr>
+            <wp:cNvGraphicFramePr>
+              <a:graphicFrameLocks xmlns:a="http://schemas.openxmlformats.org/drawingml/2006/main" noChangeAspect="1"/>
+            </wp:cNvGraphicFramePr>
+            <a:graphic xmlns:a="http://schemas.openxmlformats.org/drawingml/2006/main">
+              <a:graphicData uri="http://schemas.openxmlformats.org/drawingml/2006/picture">
+                <pic:pic xmlns:pic="http://schemas.openxmlformats.org/drawingml/2006/picture">
+                  <pic:nvPicPr>
+                    <pic:cNvPr id="10" name="Picture 9">
+                      <a:extLst>
+                        <a:ext uri="{FF2B5EF4-FFF2-40B4-BE49-F238E27FC236}">
+                          <a16:creationId xmlns:a16="http://schemas.microsoft.com/office/drawing/2014/main" id="{A200B9B1-6373-DA60-559C-ABB5D968E950}"/>
+                        </a:ext>
+                      </a:extLst>
+                    </pic:cNvPr>
+                    <pic:cNvPicPr>
+                      <a:picLocks noChangeAspect="1"/>
+                    </pic:cNvPicPr>
+                  </pic:nvPicPr>
+                  <pic:blipFill>
+                    <a:blip r:embed="rId7"/>
+                    <a:stretch>
+                      <a:fillRect/>
+                    </a:stretch>
+                  </pic:blipFill>
+                  <pic:spPr>
+                    <a:xfrm>
+                      <a:off x="0" y="0"/>
+                      <a:ext cx="3118963" cy="944862"/>
+                    </a:xfrm>
+                    <a:prstGeom prst="rect">
+                      <a:avLst/>
+                    </a:prstGeom>
+                  </pic:spPr>
+                </pic:pic>
+              </a:graphicData>
+            </a:graphic>
+          </wp:inline>
+        </w:drawing>
+      </w:r>
+    </w:p>
+    <w:p>
+      <w:pPr>
+        <w:rPr>
+          <w:lang w:val="sv-SE"/>
+        </w:rPr>
+      </w:pPr>
+      <w:r>
+        <w:drawing>
+          <wp:inline distT="0" distB="0" distL="0" distR="0" wp14:anchorId="4E4DC4B3" wp14:editId="187FD601">
+            <wp:extent cx="2660756" cy="466625"/>
+            <wp:effectExtent l="0" t="0" r="6350" b="0"/>
+            <wp:docPr id="12" name="Picture 11">
+              <a:extLst xmlns:a="http://schemas.openxmlformats.org/drawingml/2006/main">
+                <a:ext uri="{FF2B5EF4-FFF2-40B4-BE49-F238E27FC236}">
+                  <a16:creationId xmlns:a16="http://schemas.microsoft.com/office/drawing/2014/main" id="{DF34B22B-14CF-72AB-0592-2C5D7CA11CE1}"/>
+                </a:ext>
+              </a:extLst>
+            </wp:docPr>
+            <wp:cNvGraphicFramePr>
+              <a:graphicFrameLocks xmlns:a="http://schemas.openxmlformats.org/drawingml/2006/main" noChangeAspect="1"/>
+            </wp:cNvGraphicFramePr>
+            <a:graphic xmlns:a="http://schemas.openxmlformats.org/drawingml/2006/main">
+              <a:graphicData uri="http://schemas.openxmlformats.org/drawingml/2006/picture">
+                <pic:pic xmlns:pic="http://schemas.openxmlformats.org/drawingml/2006/picture">
+                  <pic:nvPicPr>
+                    <pic:cNvPr id="12" name="Picture 11">
+                      <a:extLst>
+                        <a:ext uri="{FF2B5EF4-FFF2-40B4-BE49-F238E27FC236}">
+                          <a16:creationId xmlns:a16="http://schemas.microsoft.com/office/drawing/2014/main" id="{DF34B22B-14CF-72AB-0592-2C5D7CA11CE1}"/>
+                        </a:ext>
+                      </a:extLst>
+                    </pic:cNvPr>
+                    <pic:cNvPicPr>
+                      <a:picLocks noChangeAspect="1"/>
+                    </pic:cNvPicPr>
+                  </pic:nvPicPr>
+                  <pic:blipFill>
+                    <a:blip r:embed="rId8"/>
+                    <a:stretch>
+                      <a:fillRect/>
+                    </a:stretch>
+                  </pic:blipFill>
+                  <pic:spPr>
+                    <a:xfrm>
+                      <a:off x="0" y="0"/>
+                      <a:ext cx="2660756" cy="466625"/>
+                    </a:xfrm>
+                    <a:prstGeom prst="rect">
+                      <a:avLst/>
+                    </a:prstGeom>
+                  </pic:spPr>
+                </pic:pic>
+              </a:graphicData>
+            </a:graphic>
+          </wp:inline>
+        </w:drawing>
+      </w:r>
+    </w:p>
+    <w:p>
+      <w:pPr>
+        <w:rPr>
+          <w:lang w:val="sv-SE"/>
+        </w:rPr>
+      </w:pPr>
+      <w:r>
+        <w:drawing>
+          <wp:inline distT="0" distB="0" distL="0" distR="0" wp14:anchorId="0FF78E7A" wp14:editId="2721A9C6">
+            <wp:extent cx="2530064" cy="1074950"/>
+            <wp:effectExtent l="0" t="0" r="3810" b="0"/>
+            <wp:docPr id="14" name="Picture 13">
+              <a:extLst xmlns:a="http://schemas.openxmlformats.org/drawingml/2006/main">
+                <a:ext uri="{FF2B5EF4-FFF2-40B4-BE49-F238E27FC236}">
+                  <a16:creationId xmlns:a16="http://schemas.microsoft.com/office/drawing/2014/main" id="{ADF4EE33-91AC-C9FB-1010-9C67072ABAA4}"/>
+                </a:ext>
+              </a:extLst>
+            </wp:docPr>
+            <wp:cNvGraphicFramePr>
+              <a:graphicFrameLocks xmlns:a="http://schemas.openxmlformats.org/drawingml/2006/main" noChangeAspect="1"/>
+            </wp:cNvGraphicFramePr>
+            <a:graphic xmlns:a="http://schemas.openxmlformats.org/drawingml/2006/main">
+              <a:graphicData uri="http://schemas.openxmlformats.org/drawingml/2006/picture">
+                <pic:pic xmlns:pic="http://schemas.openxmlformats.org/drawingml/2006/picture">
+                  <pic:nvPicPr>
+                    <pic:cNvPr id="14" name="Picture 13">
+                      <a:extLst>
+                        <a:ext uri="{FF2B5EF4-FFF2-40B4-BE49-F238E27FC236}">
+                          <a16:creationId xmlns:a16="http://schemas.microsoft.com/office/drawing/2014/main" id="{ADF4EE33-91AC-C9FB-1010-9C67072ABAA4}"/>
+                        </a:ext>
+                      </a:extLst>
+                    </pic:cNvPr>
+                    <pic:cNvPicPr>
+                      <a:picLocks noChangeAspect="1"/>
+                    </pic:cNvPicPr>
+                  </pic:nvPicPr>
+                  <pic:blipFill>
+                    <a:blip r:embed="rId9"/>
+                    <a:stretch>
+                      <a:fillRect/>
+                    </a:stretch>
+                  </pic:blipFill>
+                  <pic:spPr>
+                    <a:xfrm>
+                      <a:off x="0" y="0"/>
+                      <a:ext cx="2530064" cy="1074950"/>
+                    </a:xfrm>
+                    <a:prstGeom prst="rect">
+                      <a:avLst/>
+                    </a:prstGeom>
+                  </pic:spPr>
+                </pic:pic>
+              </a:graphicData>
+            </a:graphic>
+          </wp:inline>
+        </w:drawing>
+      </w:r>
+    </w:p>
+    <w:p>
+      <w:pPr>
         <w:spacing w:after="0"/>
         <w:jc w:val="both"/>
         <w:rPr>
@@ -3073,61 +2946,7 @@
           <w:sz w:val="24"/>
           <w:szCs w:val="24"/>
         </w:rPr>
-        <w:t xml:space="preserve">Metode </w:t>
-      </w:r>
-      <w:proofErr w:type="spellStart"/>
-      <w:r>
-        <w:rPr>
-          <w:rFonts w:ascii="Times New Roman" w:hAnsi="Times New Roman" w:cs="Times New Roman"/>
-          <w:sz w:val="24"/>
-          <w:szCs w:val="24"/>
-        </w:rPr>
-        <w:t>Sugeno</w:t>
-      </w:r>
-      <w:proofErr w:type="spellEnd"/>
-      <w:r>
-        <w:rPr>
-          <w:rFonts w:ascii="Times New Roman" w:hAnsi="Times New Roman" w:cs="Times New Roman"/>
-          <w:sz w:val="24"/>
-          <w:szCs w:val="24"/>
-        </w:rPr>
-        <w:t xml:space="preserve"> </w:t>
-      </w:r>
-      <w:proofErr w:type="spellStart"/>
-      <w:r>
-        <w:rPr>
-          <w:rFonts w:ascii="Times New Roman" w:hAnsi="Times New Roman" w:cs="Times New Roman"/>
-          <w:sz w:val="24"/>
-          <w:szCs w:val="24"/>
-        </w:rPr>
-        <w:t>memberikan</w:t>
-      </w:r>
-      <w:proofErr w:type="spellEnd"/>
-      <w:r>
-        <w:rPr>
-          <w:rFonts w:ascii="Times New Roman" w:hAnsi="Times New Roman" w:cs="Times New Roman"/>
-          <w:sz w:val="24"/>
-          <w:szCs w:val="24"/>
-        </w:rPr>
-        <w:t xml:space="preserve"> </w:t>
-      </w:r>
-      <w:proofErr w:type="spellStart"/>
-      <w:r>
-        <w:rPr>
-          <w:rFonts w:ascii="Times New Roman" w:hAnsi="Times New Roman" w:cs="Times New Roman"/>
-          <w:sz w:val="24"/>
-          <w:szCs w:val="24"/>
-        </w:rPr>
-        <w:t>hasil</w:t>
-      </w:r>
-      <w:proofErr w:type="spellEnd"/>
-      <w:r>
-        <w:rPr>
-          <w:rFonts w:ascii="Times New Roman" w:hAnsi="Times New Roman" w:cs="Times New Roman"/>
-          <w:sz w:val="24"/>
-          <w:szCs w:val="24"/>
-        </w:rPr>
-        <w:t xml:space="preserve"> yang objektif dan konsisten dalam memproses dataset review restoran ini.</w:t>
+        <w:t>Metode Sugeno memberikan hasil yang objektif dan konsisten dalam memproses dataset review restoran ini.</w:t>
       </w:r>
     </w:p>
     <w:sectPr>
@@ -3946,7 +3765,6 @@
   <w:style w:type="character" w:default="1" w:styleId="DefaultParagraphFont">
     <w:name w:val="Default Paragraph Font"/>
     <w:uiPriority w:val="1"/>
-    <w:semiHidden/>
     <w:unhideWhenUsed/>
   </w:style>
   <w:style w:type="table" w:default="1" w:styleId="TableNormal">

</xml_diff>

<commit_message>
Improvement: Refined fuzzy rules and added sorting tie-breaker (score > service > price)
</commit_message>
<xml_diff>
--- a/Laporan_Tugas_Fuzzy_Logic.docx
+++ b/Laporan_Tugas_Fuzzy_Logic.docx
@@ -1261,7 +1261,25 @@
           <w:sz w:val="24"/>
           <w:szCs w:val="24"/>
         </w:rPr>
-        <w:t>-Murah:&lt;=25.000(Penuh),25rb-35rb(Menurun).</w:t>
+        <w:t>-Murah:&lt;=25.000(Penuh),25rb-35</w:t>
+      </w:r>
+      <w:proofErr w:type="gramStart"/>
+      <w:r>
+        <w:rPr>
+          <w:rFonts w:ascii="Times New Roman" w:hAnsi="Times New Roman" w:cs="Times New Roman"/>
+          <w:sz w:val="24"/>
+          <w:szCs w:val="24"/>
+        </w:rPr>
+        <w:t>rb(</w:t>
+      </w:r>
+      <w:proofErr w:type="gramEnd"/>
+      <w:r>
+        <w:rPr>
+          <w:rFonts w:ascii="Times New Roman" w:hAnsi="Times New Roman" w:cs="Times New Roman"/>
+          <w:sz w:val="24"/>
+          <w:szCs w:val="24"/>
+        </w:rPr>
+        <w:t>Menurun).</w:t>
       </w:r>
     </w:p>
     <w:p>
@@ -1973,7 +1991,6 @@
           <w:rFonts w:ascii="Times New Roman" w:hAnsi="Times New Roman" w:cs="Times New Roman"/>
           <w:sz w:val="24"/>
           <w:szCs w:val="24"/>
-          <w:lang w:val="sv-SE"/>
         </w:rPr>
       </w:pPr>
       <w:r>
@@ -1981,7 +1998,6 @@
           <w:rFonts w:ascii="Times New Roman" w:hAnsi="Times New Roman" w:cs="Times New Roman"/>
           <w:sz w:val="24"/>
           <w:szCs w:val="24"/>
-          <w:lang w:val="sv-SE"/>
         </w:rPr>
         <w:t>2.Melakukan Fuzzifikasi untuk setiap baris data.</w:t>
       </w:r>
@@ -1994,7 +2010,6 @@
           <w:rFonts w:ascii="Times New Roman" w:hAnsi="Times New Roman" w:cs="Times New Roman"/>
           <w:sz w:val="24"/>
           <w:szCs w:val="24"/>
-          <w:lang w:val="sv-SE"/>
         </w:rPr>
       </w:pPr>
       <w:r>
@@ -2002,7 +2017,6 @@
           <w:rFonts w:ascii="Times New Roman" w:hAnsi="Times New Roman" w:cs="Times New Roman"/>
           <w:sz w:val="24"/>
           <w:szCs w:val="24"/>
-          <w:lang w:val="sv-SE"/>
         </w:rPr>
         <w:t>3.Mengevaluasi 9 Aturan Inferensi.</w:t>
       </w:r>
@@ -2754,6 +2768,9 @@
         </w:rPr>
       </w:pPr>
       <w:r>
+        <w:rPr>
+          <w:noProof/>
+        </w:rPr>
         <w:drawing>
           <wp:inline distT="0" distB="0" distL="0" distR="0" wp14:anchorId="31322043" wp14:editId="6B0C77F7">
             <wp:extent cx="3118963" cy="944862"/>
@@ -2812,6 +2829,9 @@
         </w:rPr>
       </w:pPr>
       <w:r>
+        <w:rPr>
+          <w:noProof/>
+        </w:rPr>
         <w:drawing>
           <wp:inline distT="0" distB="0" distL="0" distR="0" wp14:anchorId="4E4DC4B3" wp14:editId="187FD601">
             <wp:extent cx="2660756" cy="466625"/>
@@ -2870,6 +2890,9 @@
         </w:rPr>
       </w:pPr>
       <w:r>
+        <w:rPr>
+          <w:noProof/>
+        </w:rPr>
         <w:drawing>
           <wp:inline distT="0" distB="0" distL="0" distR="0" wp14:anchorId="0FF78E7A" wp14:editId="2721A9C6">
             <wp:extent cx="2530064" cy="1074950"/>
@@ -2929,6 +2952,7 @@
           <w:rFonts w:ascii="Times New Roman" w:hAnsi="Times New Roman" w:cs="Times New Roman"/>
           <w:sz w:val="24"/>
           <w:szCs w:val="24"/>
+          <w:lang w:val="sv-SE"/>
         </w:rPr>
       </w:pPr>
       <w:r>
@@ -2945,8 +2969,208 @@
           <w:rFonts w:ascii="Times New Roman" w:hAnsi="Times New Roman" w:cs="Times New Roman"/>
           <w:sz w:val="24"/>
           <w:szCs w:val="24"/>
+          <w:lang w:val="sv-SE"/>
         </w:rPr>
         <w:t>Metode Sugeno memberikan hasil yang objektif dan konsisten dalam memproses dataset review restoran ini.</w:t>
+      </w:r>
+    </w:p>
+    <w:p>
+      <w:pPr>
+        <w:spacing w:after="0"/>
+        <w:jc w:val="both"/>
+        <w:rPr>
+          <w:rFonts w:ascii="Times New Roman" w:hAnsi="Times New Roman" w:cs="Times New Roman"/>
+          <w:sz w:val="24"/>
+          <w:szCs w:val="24"/>
+          <w:lang w:val="sv-SE"/>
+        </w:rPr>
+      </w:pPr>
+    </w:p>
+    <w:p>
+      <w:pPr>
+        <w:spacing w:after="0"/>
+        <w:jc w:val="both"/>
+        <w:rPr>
+          <w:rFonts w:ascii="Times New Roman" w:hAnsi="Times New Roman" w:cs="Times New Roman"/>
+          <w:sz w:val="24"/>
+          <w:szCs w:val="24"/>
+          <w:lang w:val="sv-SE"/>
+        </w:rPr>
+      </w:pPr>
+      <w:r>
+        <w:rPr>
+          <w:rFonts w:ascii="Times New Roman" w:hAnsi="Times New Roman" w:cs="Times New Roman"/>
+          <w:sz w:val="24"/>
+          <w:szCs w:val="24"/>
+          <w:lang w:val="sv-SE"/>
+        </w:rPr>
+        <w:t>Visual:</w:t>
+      </w:r>
+    </w:p>
+    <w:p>
+      <w:pPr>
+        <w:spacing w:after="0"/>
+        <w:jc w:val="both"/>
+        <w:rPr>
+          <w:rFonts w:ascii="Times New Roman" w:hAnsi="Times New Roman" w:cs="Times New Roman"/>
+          <w:sz w:val="24"/>
+          <w:szCs w:val="24"/>
+          <w:lang w:val="sv-SE"/>
+        </w:rPr>
+      </w:pPr>
+      <w:r>
+        <w:rPr>
+          <w:rFonts w:ascii="Times New Roman" w:hAnsi="Times New Roman" w:cs="Times New Roman"/>
+          <w:sz w:val="24"/>
+          <w:szCs w:val="24"/>
+          <w:lang w:val="sv-SE"/>
+        </w:rPr>
+        <w:lastRenderedPageBreak/>
+        <w:drawing>
+          <wp:inline distT="0" distB="0" distL="0" distR="0" wp14:anchorId="67203530" wp14:editId="5342C5AD">
+            <wp:extent cx="5400040" cy="2160270"/>
+            <wp:effectExtent l="0" t="0" r="0" b="0"/>
+            <wp:docPr id="861260938" name="Picture 1"/>
+            <wp:cNvGraphicFramePr>
+              <a:graphicFrameLocks xmlns:a="http://schemas.openxmlformats.org/drawingml/2006/main" noChangeAspect="1"/>
+            </wp:cNvGraphicFramePr>
+            <a:graphic xmlns:a="http://schemas.openxmlformats.org/drawingml/2006/main">
+              <a:graphicData uri="http://schemas.openxmlformats.org/drawingml/2006/picture">
+                <pic:pic xmlns:pic="http://schemas.openxmlformats.org/drawingml/2006/picture">
+                  <pic:nvPicPr>
+                    <pic:cNvPr id="861260938" name=""/>
+                    <pic:cNvPicPr/>
+                  </pic:nvPicPr>
+                  <pic:blipFill>
+                    <a:blip r:embed="rId10"/>
+                    <a:stretch>
+                      <a:fillRect/>
+                    </a:stretch>
+                  </pic:blipFill>
+                  <pic:spPr>
+                    <a:xfrm>
+                      <a:off x="0" y="0"/>
+                      <a:ext cx="5400040" cy="2160270"/>
+                    </a:xfrm>
+                    <a:prstGeom prst="rect">
+                      <a:avLst/>
+                    </a:prstGeom>
+                  </pic:spPr>
+                </pic:pic>
+              </a:graphicData>
+            </a:graphic>
+          </wp:inline>
+        </w:drawing>
+      </w:r>
+    </w:p>
+    <w:p>
+      <w:pPr>
+        <w:spacing w:after="0"/>
+        <w:jc w:val="both"/>
+        <w:rPr>
+          <w:rFonts w:ascii="Times New Roman" w:hAnsi="Times New Roman" w:cs="Times New Roman"/>
+          <w:sz w:val="24"/>
+          <w:szCs w:val="24"/>
+          <w:lang w:val="sv-SE"/>
+        </w:rPr>
+      </w:pPr>
+      <w:r>
+        <w:rPr>
+          <w:rFonts w:ascii="Times New Roman" w:hAnsi="Times New Roman" w:cs="Times New Roman"/>
+          <w:sz w:val="24"/>
+          <w:szCs w:val="24"/>
+          <w:lang w:val="sv-SE"/>
+        </w:rPr>
+        <w:drawing>
+          <wp:inline distT="0" distB="0" distL="0" distR="0" wp14:anchorId="031332E7" wp14:editId="231C1945">
+            <wp:extent cx="5400040" cy="2160270"/>
+            <wp:effectExtent l="0" t="0" r="0" b="0"/>
+            <wp:docPr id="1358322778" name="Picture 1"/>
+            <wp:cNvGraphicFramePr>
+              <a:graphicFrameLocks xmlns:a="http://schemas.openxmlformats.org/drawingml/2006/main" noChangeAspect="1"/>
+            </wp:cNvGraphicFramePr>
+            <a:graphic xmlns:a="http://schemas.openxmlformats.org/drawingml/2006/main">
+              <a:graphicData uri="http://schemas.openxmlformats.org/drawingml/2006/picture">
+                <pic:pic xmlns:pic="http://schemas.openxmlformats.org/drawingml/2006/picture">
+                  <pic:nvPicPr>
+                    <pic:cNvPr id="1358322778" name=""/>
+                    <pic:cNvPicPr/>
+                  </pic:nvPicPr>
+                  <pic:blipFill>
+                    <a:blip r:embed="rId11"/>
+                    <a:stretch>
+                      <a:fillRect/>
+                    </a:stretch>
+                  </pic:blipFill>
+                  <pic:spPr>
+                    <a:xfrm>
+                      <a:off x="0" y="0"/>
+                      <a:ext cx="5400040" cy="2160270"/>
+                    </a:xfrm>
+                    <a:prstGeom prst="rect">
+                      <a:avLst/>
+                    </a:prstGeom>
+                  </pic:spPr>
+                </pic:pic>
+              </a:graphicData>
+            </a:graphic>
+          </wp:inline>
+        </w:drawing>
+      </w:r>
+    </w:p>
+    <w:p>
+      <w:pPr>
+        <w:spacing w:after="0"/>
+        <w:jc w:val="both"/>
+        <w:rPr>
+          <w:rFonts w:ascii="Times New Roman" w:hAnsi="Times New Roman" w:cs="Times New Roman"/>
+          <w:sz w:val="24"/>
+          <w:szCs w:val="24"/>
+          <w:lang w:val="sv-SE"/>
+        </w:rPr>
+      </w:pPr>
+      <w:r>
+        <w:rPr>
+          <w:rFonts w:ascii="Times New Roman" w:hAnsi="Times New Roman" w:cs="Times New Roman"/>
+          <w:sz w:val="24"/>
+          <w:szCs w:val="24"/>
+          <w:lang w:val="sv-SE"/>
+        </w:rPr>
+        <w:drawing>
+          <wp:inline distT="0" distB="0" distL="0" distR="0" wp14:anchorId="7F7D0454" wp14:editId="36771321">
+            <wp:extent cx="5400040" cy="3375025"/>
+            <wp:effectExtent l="0" t="0" r="0" b="0"/>
+            <wp:docPr id="155652347" name="Picture 1"/>
+            <wp:cNvGraphicFramePr>
+              <a:graphicFrameLocks xmlns:a="http://schemas.openxmlformats.org/drawingml/2006/main" noChangeAspect="1"/>
+            </wp:cNvGraphicFramePr>
+            <a:graphic xmlns:a="http://schemas.openxmlformats.org/drawingml/2006/main">
+              <a:graphicData uri="http://schemas.openxmlformats.org/drawingml/2006/picture">
+                <pic:pic xmlns:pic="http://schemas.openxmlformats.org/drawingml/2006/picture">
+                  <pic:nvPicPr>
+                    <pic:cNvPr id="155652347" name=""/>
+                    <pic:cNvPicPr/>
+                  </pic:nvPicPr>
+                  <pic:blipFill>
+                    <a:blip r:embed="rId12"/>
+                    <a:stretch>
+                      <a:fillRect/>
+                    </a:stretch>
+                  </pic:blipFill>
+                  <pic:spPr>
+                    <a:xfrm>
+                      <a:off x="0" y="0"/>
+                      <a:ext cx="5400040" cy="3375025"/>
+                    </a:xfrm>
+                    <a:prstGeom prst="rect">
+                      <a:avLst/>
+                    </a:prstGeom>
+                  </pic:spPr>
+                </pic:pic>
+              </a:graphicData>
+            </a:graphic>
+          </wp:inline>
+        </w:drawing>
       </w:r>
     </w:p>
     <w:sectPr>
@@ -3765,6 +3989,7 @@
   <w:style w:type="character" w:default="1" w:styleId="DefaultParagraphFont">
     <w:name w:val="Default Paragraph Font"/>
     <w:uiPriority w:val="1"/>
+    <w:semiHidden/>
     <w:unhideWhenUsed/>
   </w:style>
   <w:style w:type="table" w:default="1" w:styleId="TableNormal">

</xml_diff>